<commit_message>
1st global scene added
</commit_message>
<xml_diff>
--- a/test.docx
+++ b/test.docx
@@ -15,7 +15,7 @@
     <w:p>
       <w:r>
         <w:pict w14:anchorId="4B000713">
-          <v:rect id="_x0000_i1049" style="width:0;height:1.5pt" o:hralign="center" o:hrstd="t" o:hr="t" fillcolor="#a0a0a0" stroked="f"/>
+          <v:rect id="_x0000_i1025" style="width:0;height:1.5pt" o:hralign="center" o:hrstd="t" o:hr="t" fillcolor="#a0a0a0" stroked="f"/>
         </w:pict>
       </w:r>
     </w:p>
@@ -93,7 +93,15 @@
         </w:numPr>
       </w:pPr>
       <w:r>
-        <w:t>Name it BattleMonsters.</w:t>
+        <w:t xml:space="preserve">Name it </w:t>
+      </w:r>
+      <w:proofErr w:type="spellStart"/>
+      <w:r>
+        <w:t>BattleMonsters</w:t>
+      </w:r>
+      <w:proofErr w:type="spellEnd"/>
+      <w:r>
+        <w:t>.</w:t>
       </w:r>
     </w:p>
     <w:p>
@@ -220,7 +228,33 @@
         </w:numPr>
       </w:pPr>
       <w:r>
-        <w:t>Locate the folder where Godot just created your new project (you should see a project.godot file, a .sln file, and an icon.svg file inside).</w:t>
+        <w:t xml:space="preserve">Locate the folder where Godot just created your new project (you should see a </w:t>
+      </w:r>
+      <w:proofErr w:type="spellStart"/>
+      <w:proofErr w:type="gramStart"/>
+      <w:r>
+        <w:t>project.godot</w:t>
+      </w:r>
+      <w:proofErr w:type="spellEnd"/>
+      <w:proofErr w:type="gramEnd"/>
+      <w:r>
+        <w:t xml:space="preserve"> file, a .</w:t>
+      </w:r>
+      <w:proofErr w:type="spellStart"/>
+      <w:r>
+        <w:t>sln</w:t>
+      </w:r>
+      <w:proofErr w:type="spellEnd"/>
+      <w:r>
+        <w:t xml:space="preserve"> file, and an </w:t>
+      </w:r>
+      <w:proofErr w:type="spellStart"/>
+      <w:r>
+        <w:t>icon.svg</w:t>
+      </w:r>
+      <w:proofErr w:type="spellEnd"/>
+      <w:r>
+        <w:t xml:space="preserve"> file inside).</w:t>
       </w:r>
     </w:p>
     <w:p>
@@ -241,7 +275,17 @@
         <w:t>drag and drop them directly into this Godot project folder</w:t>
       </w:r>
       <w:r>
-        <w:t>, right next to project.godot.</w:t>
+        <w:t xml:space="preserve">, right next to </w:t>
+      </w:r>
+      <w:proofErr w:type="spellStart"/>
+      <w:proofErr w:type="gramStart"/>
+      <w:r>
+        <w:t>project.godot</w:t>
+      </w:r>
+      <w:proofErr w:type="spellEnd"/>
+      <w:proofErr w:type="gramEnd"/>
+      <w:r>
+        <w:t>.</w:t>
       </w:r>
     </w:p>
     <w:p>
@@ -272,7 +316,15 @@
         <w:t>Important:</w:t>
       </w:r>
       <w:r>
-        <w:t xml:space="preserve"> Godot does not automatically compile C# code when importing. Because your scripts use [GlobalClass], Godot </w:t>
+        <w:t xml:space="preserve"> Godot does not automatically compile C# code when importing. Because your scripts use [</w:t>
+      </w:r>
+      <w:proofErr w:type="spellStart"/>
+      <w:r>
+        <w:t>GlobalClass</w:t>
+      </w:r>
+      <w:proofErr w:type="spellEnd"/>
+      <w:r>
+        <w:t xml:space="preserve">], Godot </w:t>
       </w:r>
       <w:r>
         <w:rPr>
@@ -327,7 +379,7 @@
     <w:p>
       <w:r>
         <w:pict w14:anchorId="5B1C46E2">
-          <v:rect id="_x0000_i1050" style="width:0;height:1.5pt" o:hralign="center" o:hrstd="t" o:hr="t" fillcolor="#a0a0a0" stroked="f"/>
+          <v:rect id="_x0000_i1026" style="width:0;height:1.5pt" o:hralign="center" o:hrstd="t" o:hr="t" fillcolor="#a0a0a0" stroked="f"/>
         </w:pict>
       </w:r>
     </w:p>
@@ -348,7 +400,23 @@
     </w:p>
     <w:p>
       <w:r>
-        <w:t>Your architecture relies heavily on global singletons (like TurnManager.Instance, GridManager.Instance, etc.). We need to put these into a scene.</w:t>
+        <w:t xml:space="preserve">Your architecture relies heavily on global singletons (like </w:t>
+      </w:r>
+      <w:proofErr w:type="spellStart"/>
+      <w:r>
+        <w:t>TurnManager.Instance</w:t>
+      </w:r>
+      <w:proofErr w:type="spellEnd"/>
+      <w:r>
+        <w:t xml:space="preserve">, </w:t>
+      </w:r>
+      <w:proofErr w:type="spellStart"/>
+      <w:r>
+        <w:t>GridManager.Instance</w:t>
+      </w:r>
+      <w:proofErr w:type="spellEnd"/>
+      <w:r>
+        <w:t>, etc.). We need to put these into a scene.</w:t>
       </w:r>
     </w:p>
     <w:p>
@@ -410,7 +478,15 @@
         <w:t>Rename</w:t>
       </w:r>
       <w:r>
-        <w:t>, and call it GameManager.</w:t>
+        <w:t xml:space="preserve">, and call it </w:t>
+      </w:r>
+      <w:proofErr w:type="spellStart"/>
+      <w:r>
+        <w:t>GameManager</w:t>
+      </w:r>
+      <w:proofErr w:type="spellEnd"/>
+      <w:r>
+        <w:t>.</w:t>
       </w:r>
     </w:p>
     <w:p>
@@ -423,6 +499,7 @@
       <w:r>
         <w:t xml:space="preserve">In the bottom left </w:t>
       </w:r>
+      <w:proofErr w:type="spellStart"/>
       <w:r>
         <w:rPr>
           <w:b/>
@@ -430,6 +507,7 @@
         </w:rPr>
         <w:t>FileSystem</w:t>
       </w:r>
+      <w:proofErr w:type="spellEnd"/>
       <w:r>
         <w:t xml:space="preserve"> dock, navigate to Scripts/Managers/.</w:t>
       </w:r>
@@ -442,14 +520,78 @@
         </w:numPr>
       </w:pPr>
       <w:r>
-        <w:t xml:space="preserve">Select all the Manager scripts (e.g., TurnManager.cs, GridManager.cs, AoOManager.cs, EffectManager.cs, TimeManager.cs, WeatherManager.cs, etc.) and </w:t>
-      </w:r>
-      <w:r>
-        <w:rPr>
-          <w:b/>
-          <w:bCs/>
-        </w:rPr>
-        <w:t>drag and drop them onto the GameManager node</w:t>
+        <w:t xml:space="preserve">Select all the Manager scripts (e.g., </w:t>
+      </w:r>
+      <w:proofErr w:type="spellStart"/>
+      <w:r>
+        <w:t>TurnManager.cs</w:t>
+      </w:r>
+      <w:proofErr w:type="spellEnd"/>
+      <w:r>
+        <w:t xml:space="preserve">, </w:t>
+      </w:r>
+      <w:proofErr w:type="spellStart"/>
+      <w:r>
+        <w:t>GridManager.cs</w:t>
+      </w:r>
+      <w:proofErr w:type="spellEnd"/>
+      <w:r>
+        <w:t xml:space="preserve">, </w:t>
+      </w:r>
+      <w:proofErr w:type="spellStart"/>
+      <w:r>
+        <w:t>AoOManager.cs</w:t>
+      </w:r>
+      <w:proofErr w:type="spellEnd"/>
+      <w:r>
+        <w:t xml:space="preserve">, </w:t>
+      </w:r>
+      <w:proofErr w:type="spellStart"/>
+      <w:r>
+        <w:t>EffectManager.cs</w:t>
+      </w:r>
+      <w:proofErr w:type="spellEnd"/>
+      <w:r>
+        <w:t xml:space="preserve">, </w:t>
+      </w:r>
+      <w:proofErr w:type="spellStart"/>
+      <w:r>
+        <w:t>TimeManager.cs</w:t>
+      </w:r>
+      <w:proofErr w:type="spellEnd"/>
+      <w:r>
+        <w:t xml:space="preserve">, </w:t>
+      </w:r>
+      <w:proofErr w:type="spellStart"/>
+      <w:r>
+        <w:t>WeatherManager.cs</w:t>
+      </w:r>
+      <w:proofErr w:type="spellEnd"/>
+      <w:r>
+        <w:t xml:space="preserve">, etc.) and </w:t>
+      </w:r>
+      <w:r>
+        <w:rPr>
+          <w:b/>
+          <w:bCs/>
+        </w:rPr>
+        <w:t xml:space="preserve">drag and drop them onto the </w:t>
+      </w:r>
+      <w:proofErr w:type="spellStart"/>
+      <w:r>
+        <w:rPr>
+          <w:b/>
+          <w:bCs/>
+        </w:rPr>
+        <w:t>GameManager</w:t>
+      </w:r>
+      <w:proofErr w:type="spellEnd"/>
+      <w:r>
+        <w:rPr>
+          <w:b/>
+          <w:bCs/>
+        </w:rPr>
+        <w:t xml:space="preserve"> node</w:t>
       </w:r>
       <w:r>
         <w:t xml:space="preserve"> in the Scene dock.</w:t>
@@ -463,7 +605,39 @@
         </w:numPr>
       </w:pPr>
       <w:r>
-        <w:t>Save this scene (Ctrl+S or Cmd+S) inside your _Scenes folder as GameManager.tscn.</w:t>
+        <w:t>Save this scene (</w:t>
+      </w:r>
+      <w:proofErr w:type="spellStart"/>
+      <w:r>
+        <w:t>Ctrl+S</w:t>
+      </w:r>
+      <w:proofErr w:type="spellEnd"/>
+      <w:r>
+        <w:t xml:space="preserve"> or </w:t>
+      </w:r>
+      <w:proofErr w:type="spellStart"/>
+      <w:r>
+        <w:t>Cmd+S</w:t>
+      </w:r>
+      <w:proofErr w:type="spellEnd"/>
+      <w:r>
+        <w:t>) inside your _</w:t>
+      </w:r>
+      <w:proofErr w:type="gramStart"/>
+      <w:r>
+        <w:t>Scenes</w:t>
+      </w:r>
+      <w:proofErr w:type="gramEnd"/>
+      <w:r>
+        <w:t xml:space="preserve"> folder as </w:t>
+      </w:r>
+      <w:proofErr w:type="spellStart"/>
+      <w:r>
+        <w:t>GameManager.tscn</w:t>
+      </w:r>
+      <w:proofErr w:type="spellEnd"/>
+      <w:r>
+        <w:t>.</w:t>
       </w:r>
     </w:p>
     <w:p>
@@ -539,7 +713,15 @@
         </w:numPr>
       </w:pPr>
       <w:r>
-        <w:t xml:space="preserve">Click the folder icon next to the "Path" field, select your GameManager.tscn, and click </w:t>
+        <w:t xml:space="preserve">Click the folder icon next to the "Path" field, select your </w:t>
+      </w:r>
+      <w:proofErr w:type="spellStart"/>
+      <w:r>
+        <w:t>GameManager.tscn</w:t>
+      </w:r>
+      <w:proofErr w:type="spellEnd"/>
+      <w:r>
+        <w:t xml:space="preserve">, and click </w:t>
       </w:r>
       <w:r>
         <w:rPr>
@@ -559,13 +741,29 @@
           <w:i/>
           <w:iCs/>
         </w:rPr>
-        <w:t>(This ensures the GameManager loads before anything else in the game).</w:t>
+        <w:t xml:space="preserve">(This ensures the </w:t>
+      </w:r>
+      <w:proofErr w:type="spellStart"/>
+      <w:r>
+        <w:rPr>
+          <w:i/>
+          <w:iCs/>
+        </w:rPr>
+        <w:t>GameManager</w:t>
+      </w:r>
+      <w:proofErr w:type="spellEnd"/>
+      <w:r>
+        <w:rPr>
+          <w:i/>
+          <w:iCs/>
+        </w:rPr>
+        <w:t xml:space="preserve"> loads before anything else in the game).</w:t>
       </w:r>
     </w:p>
     <w:p>
       <w:r>
         <w:pict w14:anchorId="66D823EA">
-          <v:rect id="_x0000_i1051" style="width:0;height:1.5pt" o:hralign="center" o:hrstd="t" o:hr="t" fillcolor="#a0a0a0" stroked="f"/>
+          <v:rect id="_x0000_i1027" style="width:0;height:1.5pt" o:hralign="center" o:hrstd="t" o:hr="t" fillcolor="#a0a0a0" stroked="f"/>
         </w:pict>
       </w:r>
     </w:p>
@@ -637,7 +835,15 @@
         <w:t>3D Scene</w:t>
       </w:r>
       <w:r>
-        <w:t xml:space="preserve"> (creates a Node3D). Rename it TestArena.</w:t>
+        <w:t xml:space="preserve"> (creates a Node3D). Rename it </w:t>
+      </w:r>
+      <w:proofErr w:type="spellStart"/>
+      <w:r>
+        <w:t>TestArena</w:t>
+      </w:r>
+      <w:proofErr w:type="spellEnd"/>
+      <w:r>
+        <w:t>.</w:t>
       </w:r>
     </w:p>
     <w:p>
@@ -668,7 +874,15 @@
         <w:t>Camera3D</w:t>
       </w:r>
       <w:r>
-        <w:t>, and add it. Move it up and angle it down so it looks at the center of the world.</w:t>
+        <w:t xml:space="preserve">, and add it. Move it up and angle it down so it looks at the </w:t>
+      </w:r>
+      <w:proofErr w:type="spellStart"/>
+      <w:r>
+        <w:t>center</w:t>
+      </w:r>
+      <w:proofErr w:type="spellEnd"/>
+      <w:r>
+        <w:t xml:space="preserve"> of the world.</w:t>
       </w:r>
     </w:p>
     <w:p>
@@ -689,7 +903,23 @@
         <w:t>DirectionalLight3D</w:t>
       </w:r>
       <w:r>
-        <w:t xml:space="preserve"> (so your TimeManager/WeatherManager can control the sun).</w:t>
+        <w:t xml:space="preserve"> (so your </w:t>
+      </w:r>
+      <w:proofErr w:type="spellStart"/>
+      <w:r>
+        <w:t>TimeManager</w:t>
+      </w:r>
+      <w:proofErr w:type="spellEnd"/>
+      <w:r>
+        <w:t>/</w:t>
+      </w:r>
+      <w:proofErr w:type="spellStart"/>
+      <w:r>
+        <w:t>WeatherManager</w:t>
+      </w:r>
+      <w:proofErr w:type="spellEnd"/>
+      <w:r>
+        <w:t xml:space="preserve"> can control the sun).</w:t>
       </w:r>
     </w:p>
     <w:p>
@@ -709,7 +939,15 @@
         </w:numPr>
       </w:pPr>
       <w:r>
-        <w:t>The GridManager needs to know what layer the ground is on.</w:t>
+        <w:t xml:space="preserve">The </w:t>
+      </w:r>
+      <w:proofErr w:type="spellStart"/>
+      <w:r>
+        <w:t>GridManager</w:t>
+      </w:r>
+      <w:proofErr w:type="spellEnd"/>
+      <w:r>
+        <w:t xml:space="preserve"> needs to know what layer the ground is on.</w:t>
       </w:r>
     </w:p>
     <w:p>
@@ -730,7 +968,15 @@
         <w:t>StaticBody3D</w:t>
       </w:r>
       <w:r>
-        <w:t xml:space="preserve"> as a child of TestArena. Rename it Ground.</w:t>
+        <w:t xml:space="preserve"> as a child of </w:t>
+      </w:r>
+      <w:proofErr w:type="spellStart"/>
+      <w:r>
+        <w:t>TestArena</w:t>
+      </w:r>
+      <w:proofErr w:type="spellEnd"/>
+      <w:r>
+        <w:t>. Rename it Ground.</w:t>
       </w:r>
     </w:p>
     <w:p>
@@ -782,7 +1028,15 @@
         <w:t>Layer</w:t>
       </w:r>
       <w:r>
-        <w:t xml:space="preserve"> is set to 1. (This matches the UnwalkableMask logic in your scripts).</w:t>
+        <w:t xml:space="preserve"> is set to 1. (This matches the </w:t>
+      </w:r>
+      <w:proofErr w:type="spellStart"/>
+      <w:r>
+        <w:t>UnwalkableMask</w:t>
+      </w:r>
+      <w:proofErr w:type="spellEnd"/>
+      <w:r>
+        <w:t xml:space="preserve"> logic in your scripts).</w:t>
       </w:r>
     </w:p>
     <w:p>
@@ -812,7 +1066,23 @@
         <w:t>CharacterBody3D</w:t>
       </w:r>
       <w:r>
-        <w:t xml:space="preserve"> to the TestArena. Rename it Goblin_A.</w:t>
+        <w:t xml:space="preserve"> to the </w:t>
+      </w:r>
+      <w:proofErr w:type="spellStart"/>
+      <w:r>
+        <w:t>TestArena</w:t>
+      </w:r>
+      <w:proofErr w:type="spellEnd"/>
+      <w:r>
+        <w:t xml:space="preserve">. Rename it </w:t>
+      </w:r>
+      <w:proofErr w:type="spellStart"/>
+      <w:r>
+        <w:t>Goblin_A</w:t>
+      </w:r>
+      <w:proofErr w:type="spellEnd"/>
+      <w:r>
+        <w:t>.</w:t>
       </w:r>
     </w:p>
     <w:p>
@@ -835,7 +1105,23 @@
       </w:pPr>
       <w:r>
         <w:lastRenderedPageBreak/>
-        <w:t>Drag and drop the following scripts from your FileSystem onto Goblin_A:</w:t>
+        <w:t xml:space="preserve">Drag and drop the following scripts from your </w:t>
+      </w:r>
+      <w:proofErr w:type="spellStart"/>
+      <w:r>
+        <w:t>FileSystem</w:t>
+      </w:r>
+      <w:proofErr w:type="spellEnd"/>
+      <w:r>
+        <w:t xml:space="preserve"> onto </w:t>
+      </w:r>
+      <w:proofErr w:type="spellStart"/>
+      <w:r>
+        <w:t>Goblin_A</w:t>
+      </w:r>
+      <w:proofErr w:type="spellEnd"/>
+      <w:r>
+        <w:t>:</w:t>
       </w:r>
     </w:p>
     <w:p>
@@ -845,9 +1131,11 @@
           <w:numId w:val="9"/>
         </w:numPr>
       </w:pPr>
+      <w:proofErr w:type="spellStart"/>
       <w:r>
         <w:t>CreatureStats.cs</w:t>
       </w:r>
+      <w:proofErr w:type="spellEnd"/>
     </w:p>
     <w:p>
       <w:pPr>
@@ -856,9 +1144,11 @@
           <w:numId w:val="9"/>
         </w:numPr>
       </w:pPr>
+      <w:proofErr w:type="spellStart"/>
       <w:r>
         <w:t>ActionManager.cs</w:t>
       </w:r>
+      <w:proofErr w:type="spellEnd"/>
     </w:p>
     <w:p>
       <w:pPr>
@@ -867,9 +1157,11 @@
           <w:numId w:val="9"/>
         </w:numPr>
       </w:pPr>
+      <w:proofErr w:type="spellStart"/>
       <w:r>
         <w:t>AIController.cs</w:t>
       </w:r>
+      <w:proofErr w:type="spellEnd"/>
     </w:p>
     <w:p>
       <w:pPr>
@@ -878,9 +1170,11 @@
           <w:numId w:val="9"/>
         </w:numPr>
       </w:pPr>
+      <w:proofErr w:type="spellStart"/>
       <w:r>
         <w:t>StatusEffectController.cs</w:t>
       </w:r>
+      <w:proofErr w:type="spellEnd"/>
     </w:p>
     <w:p>
       <w:pPr>
@@ -889,9 +1183,11 @@
           <w:numId w:val="9"/>
         </w:numPr>
       </w:pPr>
+      <w:proofErr w:type="spellStart"/>
       <w:r>
         <w:t>CombatStateController.cs</w:t>
       </w:r>
+      <w:proofErr w:type="spellEnd"/>
     </w:p>
     <w:p>
       <w:pPr>
@@ -900,9 +1196,11 @@
           <w:numId w:val="9"/>
         </w:numPr>
       </w:pPr>
+      <w:proofErr w:type="spellStart"/>
       <w:r>
         <w:t>InventoryController.cs</w:t>
       </w:r>
+      <w:proofErr w:type="spellEnd"/>
     </w:p>
     <w:p>
       <w:pPr>
@@ -911,9 +1209,11 @@
           <w:numId w:val="9"/>
         </w:numPr>
       </w:pPr>
+      <w:proofErr w:type="spellStart"/>
       <w:r>
         <w:t>CreatureMover.cs</w:t>
       </w:r>
+      <w:proofErr w:type="spellEnd"/>
     </w:p>
     <w:p>
       <w:pPr>
@@ -933,7 +1233,15 @@
         <w:t>CollisionShape3D</w:t>
       </w:r>
       <w:r>
-        <w:t xml:space="preserve"> to Goblin_A (make it a CapsuleShape3D). In its Collision properties, set its </w:t>
+        <w:t xml:space="preserve"> to </w:t>
+      </w:r>
+      <w:proofErr w:type="spellStart"/>
+      <w:r>
+        <w:t>Goblin_A</w:t>
+      </w:r>
+      <w:proofErr w:type="spellEnd"/>
+      <w:r>
+        <w:t xml:space="preserve"> (make it a CapsuleShape3D). In its Collision properties, set its </w:t>
       </w:r>
       <w:r>
         <w:rPr>
@@ -963,7 +1271,15 @@
         </w:numPr>
       </w:pPr>
       <w:r>
-        <w:t xml:space="preserve">In the FileSystem dock, right-click inside your Data/Creatures folder -&gt; </w:t>
+        <w:t xml:space="preserve">In the </w:t>
+      </w:r>
+      <w:proofErr w:type="spellStart"/>
+      <w:r>
+        <w:t>FileSystem</w:t>
+      </w:r>
+      <w:proofErr w:type="spellEnd"/>
+      <w:r>
+        <w:t xml:space="preserve"> dock, right-click inside your Data/Creatures folder -&gt; </w:t>
       </w:r>
       <w:r>
         <w:rPr>
@@ -994,7 +1310,23 @@
         </w:numPr>
       </w:pPr>
       <w:r>
-        <w:t>Search for CreatureTemplate_SO and create it. Name it GoblinTemplate.tres.</w:t>
+        <w:t xml:space="preserve">Search for </w:t>
+      </w:r>
+      <w:proofErr w:type="spellStart"/>
+      <w:r>
+        <w:t>CreatureTemplate_SO</w:t>
+      </w:r>
+      <w:proofErr w:type="spellEnd"/>
+      <w:r>
+        <w:t xml:space="preserve"> and create it. Name it </w:t>
+      </w:r>
+      <w:proofErr w:type="spellStart"/>
+      <w:r>
+        <w:t>GoblinTemplate.tres</w:t>
+      </w:r>
+      <w:proofErr w:type="spellEnd"/>
+      <w:r>
+        <w:t>.</w:t>
       </w:r>
     </w:p>
     <w:p>
@@ -1005,7 +1337,15 @@
         </w:numPr>
       </w:pPr>
       <w:r>
-        <w:t>Double-click it. In the Inspector, give it some basic stats (HP: 10, Speed_Land: 30, Size: Medium).</w:t>
+        <w:t xml:space="preserve">Double-click it. In the Inspector, give it some basic stats (HP: 10, </w:t>
+      </w:r>
+      <w:proofErr w:type="spellStart"/>
+      <w:r>
+        <w:t>Speed_Land</w:t>
+      </w:r>
+      <w:proofErr w:type="spellEnd"/>
+      <w:r>
+        <w:t>: 30, Size: Medium).</w:t>
       </w:r>
     </w:p>
     <w:p>
@@ -1016,7 +1356,31 @@
         </w:numPr>
       </w:pPr>
       <w:r>
-        <w:t xml:space="preserve">Click on your Goblin_A node in the scene. In the Inspector, find the CreatureStats section. Drag your GoblinTemplate.tres into the </w:t>
+        <w:t xml:space="preserve">Click on your </w:t>
+      </w:r>
+      <w:proofErr w:type="spellStart"/>
+      <w:r>
+        <w:t>Goblin_A</w:t>
+      </w:r>
+      <w:proofErr w:type="spellEnd"/>
+      <w:r>
+        <w:t xml:space="preserve"> node in the scene. In the Inspector, find the </w:t>
+      </w:r>
+      <w:proofErr w:type="spellStart"/>
+      <w:r>
+        <w:t>CreatureStats</w:t>
+      </w:r>
+      <w:proofErr w:type="spellEnd"/>
+      <w:r>
+        <w:t xml:space="preserve"> section. Drag your </w:t>
+      </w:r>
+      <w:proofErr w:type="spellStart"/>
+      <w:r>
+        <w:t>GoblinTemplate.tres</w:t>
+      </w:r>
+      <w:proofErr w:type="spellEnd"/>
+      <w:r>
+        <w:t xml:space="preserve"> into the </w:t>
       </w:r>
       <w:r>
         <w:rPr>
@@ -1035,13 +1399,45 @@
           <w:i/>
           <w:iCs/>
         </w:rPr>
-        <w:t>(Optional: Duplicate Goblin_A to make Goblin_B and put them a few units apart so they can fight).</w:t>
+        <w:t xml:space="preserve">(Optional: Duplicate </w:t>
+      </w:r>
+      <w:proofErr w:type="spellStart"/>
+      <w:r>
+        <w:rPr>
+          <w:i/>
+          <w:iCs/>
+        </w:rPr>
+        <w:t>Goblin_A</w:t>
+      </w:r>
+      <w:proofErr w:type="spellEnd"/>
+      <w:r>
+        <w:rPr>
+          <w:i/>
+          <w:iCs/>
+        </w:rPr>
+        <w:t xml:space="preserve"> to make </w:t>
+      </w:r>
+      <w:proofErr w:type="spellStart"/>
+      <w:r>
+        <w:rPr>
+          <w:i/>
+          <w:iCs/>
+        </w:rPr>
+        <w:t>Goblin_B</w:t>
+      </w:r>
+      <w:proofErr w:type="spellEnd"/>
+      <w:r>
+        <w:rPr>
+          <w:i/>
+          <w:iCs/>
+        </w:rPr>
+        <w:t xml:space="preserve"> and put them a few units apart so they can fight).</w:t>
       </w:r>
     </w:p>
     <w:p>
       <w:r>
         <w:pict w14:anchorId="0CE6C3B8">
-          <v:rect id="_x0000_i1052" style="width:0;height:1.5pt" o:hralign="center" o:hrstd="t" o:hr="t" fillcolor="#a0a0a0" stroked="f"/>
+          <v:rect id="_x0000_i1028" style="width:0;height:1.5pt" o:hralign="center" o:hrstd="t" o:hr="t" fillcolor="#a0a0a0" stroked="f"/>
         </w:pict>
       </w:r>
     </w:p>
@@ -1062,7 +1458,15 @@
     </w:p>
     <w:p>
       <w:r>
-        <w:t>Because your game currently lacks a 3D User Interface, all of the combat logic, dice rolls, and AI decisions will be printed to the Godot console.</w:t>
+        <w:t xml:space="preserve">Because your game currently lacks a 3D User Interface, </w:t>
+      </w:r>
+      <w:proofErr w:type="gramStart"/>
+      <w:r>
+        <w:t>all of</w:t>
+      </w:r>
+      <w:proofErr w:type="gramEnd"/>
+      <w:r>
+        <w:t xml:space="preserve"> the combat logic, dice rolls, and AI decisions will be printed to the Godot console.</w:t>
       </w:r>
     </w:p>
     <w:p>
@@ -1086,7 +1490,15 @@
         </w:numPr>
       </w:pPr>
       <w:r>
-        <w:t>Add a new script to your TestArena root node.</w:t>
+        <w:t xml:space="preserve">Add a new script to your </w:t>
+      </w:r>
+      <w:proofErr w:type="spellStart"/>
+      <w:r>
+        <w:t>TestArena</w:t>
+      </w:r>
+      <w:proofErr w:type="spellEnd"/>
+      <w:r>
+        <w:t xml:space="preserve"> root node.</w:t>
       </w:r>
     </w:p>
     <w:p>
@@ -1107,13 +1519,31 @@
     </w:p>
     <w:p>
       <w:r>
-        <w:t>using Godot;</w:t>
-      </w:r>
+        <w:t xml:space="preserve">using </w:t>
+      </w:r>
+      <w:proofErr w:type="gramStart"/>
+      <w:r>
+        <w:t>Godot;</w:t>
+      </w:r>
+      <w:proofErr w:type="gramEnd"/>
     </w:p>
     <w:p/>
     <w:p>
       <w:r>
-        <w:t>public partial class TestArena : Node3D</w:t>
+        <w:t xml:space="preserve">public partial class </w:t>
+      </w:r>
+      <w:proofErr w:type="spellStart"/>
+      <w:proofErr w:type="gramStart"/>
+      <w:r>
+        <w:t>TestArena</w:t>
+      </w:r>
+      <w:proofErr w:type="spellEnd"/>
+      <w:r>
+        <w:t xml:space="preserve"> :</w:t>
+      </w:r>
+      <w:proofErr w:type="gramEnd"/>
+      <w:r>
+        <w:t xml:space="preserve"> Node3D</w:t>
       </w:r>
     </w:p>
     <w:p>
@@ -1124,7 +1554,15 @@
     <w:p>
       <w:r>
         <w:lastRenderedPageBreak/>
-        <w:t xml:space="preserve">    public override void _Ready()</w:t>
+        <w:t xml:space="preserve">    public override void _</w:t>
+      </w:r>
+      <w:proofErr w:type="gramStart"/>
+      <w:r>
+        <w:t>Ready(</w:t>
+      </w:r>
+      <w:proofErr w:type="gramEnd"/>
+      <w:r>
+        <w:t>)</w:t>
       </w:r>
     </w:p>
     <w:p>
@@ -1139,8 +1577,23 @@
     </w:p>
     <w:p>
       <w:r>
-        <w:t xml:space="preserve">        TurnManager.Instance.StartCombat();</w:t>
-      </w:r>
+        <w:t xml:space="preserve">        </w:t>
+      </w:r>
+      <w:proofErr w:type="spellStart"/>
+      <w:proofErr w:type="gramStart"/>
+      <w:r>
+        <w:t>TurnManager.Instance.StartCombat</w:t>
+      </w:r>
+      <w:proofErr w:type="spellEnd"/>
+      <w:proofErr w:type="gramEnd"/>
+      <w:r>
+        <w:t>(</w:t>
+      </w:r>
+      <w:proofErr w:type="gramStart"/>
+      <w:r>
+        <w:t>);</w:t>
+      </w:r>
+      <w:proofErr w:type="gramEnd"/>
     </w:p>
     <w:p>
       <w:r>
@@ -1190,7 +1643,15 @@
         </w:numPr>
       </w:pPr>
       <w:r>
-        <w:t>Godot will ask you to select a Main Scene. Choose your TestArena.tscn.</w:t>
+        <w:t xml:space="preserve">Godot will ask you to select a Main Scene. Choose your </w:t>
+      </w:r>
+      <w:proofErr w:type="spellStart"/>
+      <w:r>
+        <w:t>TestArena.tscn</w:t>
+      </w:r>
+      <w:proofErr w:type="spellEnd"/>
+      <w:r>
+        <w:t>.</w:t>
       </w:r>
     </w:p>
     <w:p>
@@ -1263,8 +1724,13 @@
           <w:numId w:val="13"/>
         </w:numPr>
       </w:pPr>
-      <w:r>
-        <w:t>Goblin_A (Primary) rolls a 14...</w:t>
+      <w:proofErr w:type="spellStart"/>
+      <w:r>
+        <w:t>Goblin_A</w:t>
+      </w:r>
+      <w:proofErr w:type="spellEnd"/>
+      <w:r>
+        <w:t xml:space="preserve"> (Primary) rolls a 14...</w:t>
       </w:r>
     </w:p>
     <w:p>
@@ -1285,8 +1751,13 @@
           <w:numId w:val="13"/>
         </w:numPr>
       </w:pPr>
-      <w:r>
-        <w:t>Goblin_A decides on plan: Move to position -&gt; Attack with Unarmed Strike...</w:t>
+      <w:proofErr w:type="spellStart"/>
+      <w:r>
+        <w:t>Goblin_A</w:t>
+      </w:r>
+      <w:proofErr w:type="spellEnd"/>
+      <w:r>
+        <w:t xml:space="preserve"> decides on plan: Move to position -&gt; Attack with Unarmed Strike...</w:t>
       </w:r>
     </w:p>
     <w:p>
@@ -1296,8 +1767,13 @@
           <w:numId w:val="13"/>
         </w:numPr>
       </w:pPr>
-      <w:r>
-        <w:t>Goblin_A moves to...</w:t>
+      <w:proofErr w:type="spellStart"/>
+      <w:r>
+        <w:t>Goblin_A</w:t>
+      </w:r>
+      <w:proofErr w:type="spellEnd"/>
+      <w:r>
+        <w:t xml:space="preserve"> moves to...</w:t>
       </w:r>
     </w:p>
     <w:p>
@@ -1307,8 +1783,21 @@
           <w:numId w:val="13"/>
         </w:numPr>
       </w:pPr>
-      <w:r>
-        <w:t>Goblin_A attacks Goblin_B! Rolls 17 vs AC 10.</w:t>
+      <w:proofErr w:type="spellStart"/>
+      <w:r>
+        <w:t>Goblin_A</w:t>
+      </w:r>
+      <w:proofErr w:type="spellEnd"/>
+      <w:r>
+        <w:t xml:space="preserve"> attacks </w:t>
+      </w:r>
+      <w:proofErr w:type="spellStart"/>
+      <w:r>
+        <w:t>Goblin_B</w:t>
+      </w:r>
+      <w:proofErr w:type="spellEnd"/>
+      <w:r>
+        <w:t>! Rolls 17 vs AC 10.</w:t>
       </w:r>
     </w:p>
     <w:p>
@@ -1318,8 +1807,13 @@
           <w:numId w:val="13"/>
         </w:numPr>
       </w:pPr>
-      <w:r>
-        <w:t>Goblin_B takes 3 Bludgeoning damage...</w:t>
+      <w:proofErr w:type="spellStart"/>
+      <w:r>
+        <w:t>Goblin_B</w:t>
+      </w:r>
+      <w:proofErr w:type="spellEnd"/>
+      <w:r>
+        <w:t xml:space="preserve"> takes 3 Bludgeoning damage...</w:t>
       </w:r>
     </w:p>
     <w:p>
@@ -1352,7 +1846,23 @@
         <w:t>Missing components:</w:t>
       </w:r>
       <w:r>
-        <w:t xml:space="preserve"> If an AI throws a Null Reference Exception, it usually means you forgot to attach one of the required sibling scripts (like CreatureMover or ActionManager) to the CharacterBody3D.</w:t>
+        <w:t xml:space="preserve"> If an AI throws a Null Reference Exception, it usually means you forgot to attach one of the required sibling scripts (like </w:t>
+      </w:r>
+      <w:proofErr w:type="spellStart"/>
+      <w:r>
+        <w:t>CreatureMover</w:t>
+      </w:r>
+      <w:proofErr w:type="spellEnd"/>
+      <w:r>
+        <w:t xml:space="preserve"> or </w:t>
+      </w:r>
+      <w:proofErr w:type="spellStart"/>
+      <w:r>
+        <w:t>ActionManager</w:t>
+      </w:r>
+      <w:proofErr w:type="spellEnd"/>
+      <w:r>
+        <w:t>) to the CharacterBody3D.</w:t>
       </w:r>
     </w:p>
     <w:p>
@@ -1370,7 +1880,15 @@
         <w:t>Nothing happens:</w:t>
       </w:r>
       <w:r>
-        <w:t xml:space="preserve"> Ensure you actually clicked the </w:t>
+        <w:t xml:space="preserve"> Ensure you </w:t>
+      </w:r>
+      <w:proofErr w:type="gramStart"/>
+      <w:r>
+        <w:t>actually clicked</w:t>
+      </w:r>
+      <w:proofErr w:type="gramEnd"/>
+      <w:r>
+        <w:t xml:space="preserve"> the </w:t>
       </w:r>
       <w:r>
         <w:rPr>
@@ -1398,7 +1916,31 @@
         <w:t>Physics warnings:</w:t>
       </w:r>
       <w:r>
-        <w:t xml:space="preserve"> Ensure your GridManager in the Autoload scene has its UnwalkableMask set to layer 1, and CreatureMask set to layer 2.</w:t>
+        <w:t xml:space="preserve"> Ensure your </w:t>
+      </w:r>
+      <w:proofErr w:type="spellStart"/>
+      <w:r>
+        <w:t>GridManager</w:t>
+      </w:r>
+      <w:proofErr w:type="spellEnd"/>
+      <w:r>
+        <w:t xml:space="preserve"> in the Autoload scene has its </w:t>
+      </w:r>
+      <w:proofErr w:type="spellStart"/>
+      <w:r>
+        <w:t>UnwalkableMask</w:t>
+      </w:r>
+      <w:proofErr w:type="spellEnd"/>
+      <w:r>
+        <w:t xml:space="preserve"> set to layer 1, and </w:t>
+      </w:r>
+      <w:proofErr w:type="spellStart"/>
+      <w:r>
+        <w:t>CreatureMask</w:t>
+      </w:r>
+      <w:proofErr w:type="spellEnd"/>
+      <w:r>
+        <w:t xml:space="preserve"> set to layer 2.</w:t>
       </w:r>
     </w:p>
     <w:p/>
@@ -3756,6 +4298,7 @@
   <w:style w:type="character" w:default="1" w:styleId="DefaultParagraphFont">
     <w:name w:val="Default Paragraph Font"/>
     <w:uiPriority w:val="1"/>
+    <w:semiHidden/>
     <w:unhideWhenUsed/>
   </w:style>
   <w:style w:type="table" w:default="1" w:styleId="TableNormal">

</xml_diff>